<commit_message>
John Travolta: revisão da Parte 3
Co-Authored-By: Claude Opus 5.5 <noreply@anthropic.com>
Claude-Session: https://claude.ai/code/session_01MJjUEEZrxQDEUifKK2vj9g
</commit_message>
<xml_diff>
--- a/roteiros/john-travolta/Travolta_Parte3.docx
+++ b/roteiros/john-travolta/Travolta_Parte3.docx
@@ -135,7 +135,7 @@
         <w:rPr>
           <w:color w:val="000000"/>
         </w:rPr>
-        <w:t>Mas foi justamente nesse período que a vida dele mudou de novo.</w:t>
+        <w:t>Foi justamente nesse período que a vida dele mudou de novo.</w:t>
       </w:r>
     </w:p>
     <w:p>
@@ -175,7 +175,7 @@
         <w:rPr>
           <w:color w:val="000000"/>
         </w:rPr>
-        <w:t>Treze anos depois de perder a mãe, John Travolta finalmente tinha de novo uma mulher ao lado dele. Uma família para construir.</w:t>
+        <w:t>Treze anos depois de perder a mãe, John Travolta tinha de novo uma família para construir.</w:t>
       </w:r>
     </w:p>
     <w:p>
@@ -191,7 +191,7 @@
         <w:rPr>
           <w:color w:val="000000"/>
         </w:rPr>
-        <w:t>Em abril de mil novecentos e noventa e dois, nasceu o primeiro filho do casal.</w:t>
+        <w:t>Treze de abril de mil novecentos e noventa e dois. Nasce o primeiro filho do casal. John tinha trinta e oito anos.</w:t>
       </w:r>
     </w:p>
     <w:p>
@@ -303,7 +303,7 @@
         <w:rPr>
           <w:color w:val="000000"/>
         </w:rPr>
-        <w:t>O mundo inteiro lembrou de Tony Manero.</w:t>
+        <w:t>O mundo inteiro lembrou de Tony Manero. John tinha quarenta anos, e a cena virou uma das mais imitadas do cinema.</w:t>
       </w:r>
     </w:p>
     <w:p>
@@ -319,7 +319,7 @@
         <w:rPr>
           <w:color w:val="000000"/>
         </w:rPr>
-        <w:t>Nos anos seguintes, John emendou um sucesso atrás do outro. Fez filmes de ação, como A Outra Face, e até um musical, Hairspray, em que apareceu irreconhecível, vestido de mulher.</w:t>
+        <w:t>Nos anos seguintes, John voltou a estrelar grandes produções. Fez filmes de ação, como A Outra Face, e até um musical, Hairspray, em que apareceu irreconhecível, vestido de mulher.</w:t>
       </w:r>
     </w:p>
     <w:p>
@@ -367,7 +367,7 @@
         <w:rPr>
           <w:color w:val="000000"/>
         </w:rPr>
-        <w:t>Os Travolta foram passar a virada do ano na casa de férias, num condomínio de luxo à beira-mar, com marina particular, chamado Old Bahama Bay, no extremo oeste da ilha.</w:t>
+        <w:t>Os Travolta foram passar a virada do ano na casa de férias, num condomínio de luxo à beira-mar, com marina particular, chamado Old Bahama Bay, no extremo oeste da ilha. Dali até a costa da Flórida eram cerca de noventa quilômetros de mar.</w:t>
       </w:r>
     </w:p>
     <w:p>
@@ -391,7 +391,7 @@
         <w:rPr>
           <w:color w:val="000000"/>
         </w:rPr>
-        <w:t>Por causa das convulsões, segundo os advogados da família, o adolescente era acompanhado o tempo todo. Havia babás e cuidadores contratados só para isso.</w:t>
+        <w:t>Por causa das convulsões, havia babás e cuidadores contratados para acompanhar o adolescente.</w:t>
       </w:r>
     </w:p>
     <w:p>
@@ -448,14 +448,6 @@
           <w:color w:val="000000"/>
         </w:rPr>
         <w:t>John desceu as escadas correndo, com Kelly logo atrás.</w:t>
-      </w:r>
-    </w:p>
-    <w:p>
-      <w:r>
-        <w:rPr>
-          <w:color w:val="000000"/>
-        </w:rPr>
-        <w:t>Cada degrau parecia longo demais.</w:t>
       </w:r>
     </w:p>
     <w:p>
@@ -543,7 +535,7 @@
         <w:rPr>
           <w:color w:val="1F4EB4"/>
         </w:rPr>
-        <w:t>Mas a pior parte dessa história ainda estava por vir. Porque aquele papel que John assinou na manhã em que o filho morreu não ficou esquecido. Alguém guardou aquele documento. E, meses depois, John Travolta ia descobrir quanto essa pessoa queria cobrar para não usá-lo contra ele.</w:t>
+        <w:t>Mas a pior parte dessa história ainda estava por vir. Porque aquele papel que John assinou na manhã em que o filho morreu não ficou esquecido. Meses depois, aquele papel ia aparecer no centro de uma ameaça milionária. E no centro de um julgamento que obrigou John Travolta a revelar, diante do mundo, o segredo que a família guardava havia dezesseis anos.</w:t>
       </w:r>
     </w:p>
     <w:sectPr>

</xml_diff>